<commit_message>
doc: Revised extension doc
</commit_message>
<xml_diff>
--- a/article/extension/word/extension-letter.docx
+++ b/article/extension/word/extension-letter.docx
@@ -252,13 +252,7 @@
         <w:t>,</w:t>
       </w:r>
       <w:r>
-        <w:t xml:space="preserve"> </w:t>
-      </w:r>
-      <w:r>
-        <w:t>“</w:t>
-      </w:r>
-      <w:r>
-        <w:t>An Interpretable Statistical Surrogate of Activated Sludge Systems that Preserves Mass Conservation and Component Non-Negativity</w:t>
+        <w:t xml:space="preserve"> “An Interpretable Statistical Surrogate of Activated Sludge Systems that Preserves Mass Conservation and Component Non-Negativity</w:t>
       </w:r>
       <w:r>
         <w:t>,” was accepted for publication</w:t>
@@ -277,10 +271,7 @@
         <w:t>Digital Chemical Engineering</w:t>
       </w:r>
       <w:r>
-        <w:t xml:space="preserve"> (</w:t>
-      </w:r>
-      <w:r>
-        <w:t>IF</w:t>
+        <w:t xml:space="preserve"> (IF</w:t>
       </w:r>
       <w:r>
         <w:t xml:space="preserve"> = </w:t>
@@ -292,30 +283,14 @@
         <w:t>). I have also submitted a</w:t>
       </w:r>
       <w:r>
-        <w:t xml:space="preserve"> second</w:t>
-      </w:r>
-      <w:r>
-        <w:t xml:space="preserve"> </w:t>
-      </w:r>
-      <w:r>
-        <w:t xml:space="preserve">related </w:t>
-      </w:r>
-      <w:r>
-        <w:t xml:space="preserve">paper to </w:t>
+        <w:t xml:space="preserve"> second related paper to </w:t>
       </w:r>
       <w:r>
         <w:rPr>
           <w:i/>
           <w:iCs/>
         </w:rPr>
-        <w:t xml:space="preserve">Computers </w:t>
-      </w:r>
-      <w:r>
-        <w:rPr>
-          <w:i/>
-          <w:iCs/>
-        </w:rPr>
-        <w:t>&amp; Chemical Engineering</w:t>
+        <w:t>Computers &amp; Chemical Engineering</w:t>
       </w:r>
       <w:r>
         <w:t xml:space="preserve"> titled “</w:t>
@@ -371,46 +346,19 @@
         <w:t>The process of</w:t>
       </w:r>
       <w:r>
-        <w:t xml:space="preserve"> </w:t>
-      </w:r>
-      <w:r>
-        <w:t xml:space="preserve">publishing two </w:t>
-      </w:r>
-      <w:r>
-        <w:t xml:space="preserve">articles </w:t>
-      </w:r>
-      <w:r>
-        <w:t xml:space="preserve">in </w:t>
-      </w:r>
-      <w:r>
-        <w:t>top-tier</w:t>
-      </w:r>
-      <w:r>
-        <w:t xml:space="preserve"> </w:t>
+        <w:t xml:space="preserve"> publishing two articles in top-tier </w:t>
       </w:r>
       <w:r>
         <w:t>journals has required multiple rounds of review and revision, which extended beyond</w:t>
       </w:r>
       <w:r>
-        <w:t xml:space="preserve"> the </w:t>
-      </w:r>
-      <w:r>
-        <w:t xml:space="preserve">initial </w:t>
-      </w:r>
-      <w:r>
-        <w:t>one</w:t>
+        <w:t xml:space="preserve"> the initial one</w:t>
       </w:r>
       <w:r>
         <w:t>-</w:t>
       </w:r>
       <w:r>
-        <w:t>year extension</w:t>
-      </w:r>
-      <w:r>
-        <w:t xml:space="preserve"> period</w:t>
-      </w:r>
-      <w:r>
-        <w:t>.</w:t>
+        <w:t>year extension period.</w:t>
       </w:r>
     </w:p>
     <w:p>
@@ -449,10 +397,7 @@
         <w:spacing w:after="0" w:line="240" w:lineRule="auto"/>
       </w:pPr>
       <w:r>
-        <w:t xml:space="preserve">Based on a detailed plan and timeline developed in consultation with my adviser, I </w:t>
-      </w:r>
-      <w:r>
-        <w:t>respectfully</w:t>
+        <w:t>Based on a detailed plan and timeline developed in consultation with my adviser, I respectfully</w:t>
       </w:r>
       <w:r>
         <w:t xml:space="preserve"> request one final scholarship extension until July 2027.</w:t>
@@ -498,12 +443,6 @@
       <w:r>
         <w:t>will be disbursed during the extension period.</w:t>
       </w:r>
-      <w:r>
-        <w:t xml:space="preserve"> </w:t>
-      </w:r>
-      <w:r>
-        <w:t>I also understand that I may only avail myself of the remaining grants from my original allocation.</w:t>
-      </w:r>
     </w:p>
     <w:p>
       <w:pPr>
@@ -539,10 +478,7 @@
         <w:spacing w:after="0" w:line="240" w:lineRule="auto"/>
       </w:pPr>
       <w:r>
-        <w:t xml:space="preserve">2. Approved Thesis Proposal </w:t>
-      </w:r>
-      <w:r>
-        <w:t>Approval Sheet</w:t>
+        <w:t>2. Approved Thesis Proposal Approval Sheet</w:t>
       </w:r>
       <w:r>
         <w:t>;</w:t>
@@ -2306,6 +2242,7 @@
   <w:style w:type="character" w:default="1" w:styleId="DefaultParagraphFont">
     <w:name w:val="Default Paragraph Font"/>
     <w:uiPriority w:val="1"/>
+    <w:semiHidden/>
     <w:unhideWhenUsed/>
   </w:style>
   <w:style w:type="table" w:default="1" w:styleId="TableNormal">

</xml_diff>